<commit_message>
Improve UGC brief generator pack
</commit_message>
<xml_diff>
--- a/content/member-assets/ugc-brief-generator/ai-automation-pack.docx
+++ b/content/member-assets/ugc-brief-generator/ai-automation-pack.docx
@@ -331,6 +331,9 @@
         <w:gridCol w:w="3600"/>
       </w:tblGrid>
       <w:tr>
+        <w:trPr>
+          <w:tblHeader/>
+        </w:trPr>
         <w:tc>
           <w:tcPr>
             <w:tcW w:w="1620" w:type="dxa"/>
@@ -673,13 +676,16 @@
         <w:tblLook w:firstRow="1" w:noHBand="0" w:noVBand="1"/>
       </w:tblPr>
       <w:tblGrid>
-        <w:gridCol w:w="1180"/>
-        <w:gridCol w:w="7940"/>
+        <w:gridCol w:w="1500"/>
+        <w:gridCol w:w="7620"/>
       </w:tblGrid>
       <w:tr>
-        <w:tc>
-          <w:tcPr>
-            <w:tcW w:w="1180" w:type="dxa"/>
+        <w:trPr>
+          <w:tblHeader/>
+        </w:trPr>
+        <w:tc>
+          <w:tcPr>
+            <w:tcW w:w="1500" w:type="dxa"/>
             <w:shd w:fill="0A0A0A"/>
             <w:tcMar>
               <w:top w:w="120" w:type="dxa"/>
@@ -700,7 +706,7 @@
         </w:tc>
         <w:tc>
           <w:tcPr>
-            <w:tcW w:w="7940" w:type="dxa"/>
+            <w:tcW w:w="7620" w:type="dxa"/>
             <w:shd w:fill="0A0A0A"/>
             <w:tcMar>
               <w:top w:w="120" w:type="dxa"/>
@@ -723,7 +729,7 @@
       <w:tr>
         <w:tc>
           <w:tcPr>
-            <w:tcW w:w="1180" w:type="dxa"/>
+            <w:tcW w:w="1500" w:type="dxa"/>
             <w:shd w:fill="F5F3F1"/>
             <w:tcMar>
               <w:top w:w="120" w:type="dxa"/>
@@ -744,30 +750,30 @@
         </w:tc>
         <w:tc>
           <w:tcPr>
-            <w:tcW w:w="7940" w:type="dxa"/>
-            <w:shd w:fill="F5F3F1"/>
-            <w:tcMar>
-              <w:top w:w="120" w:type="dxa"/>
-              <w:left w:w="150" w:type="dxa"/>
-              <w:bottom w:w="120" w:type="dxa"/>
-              <w:right w:w="150" w:type="dxa"/>
-            </w:tcMar>
-            <w:vAlign w:val="center"/>
-          </w:tcPr>
-          <w:p>
-            <w:pPr>
-              <w:pStyle w:val="TableCell"/>
-            </w:pPr>
-            <w:r>
-              <w:t xml:space="preserve">How to use these automations - Each automation below is a ready prompt you can paste into an AI agent (ChatGPT, Claude, or…</w:t>
-            </w:r>
-          </w:p>
-        </w:tc>
-      </w:tr>
-      <w:tr>
-        <w:tc>
-          <w:tcPr>
-            <w:tcW w:w="1180" w:type="dxa"/>
+            <w:tcW w:w="7620" w:type="dxa"/>
+            <w:shd w:fill="F5F3F1"/>
+            <w:tcMar>
+              <w:top w:w="120" w:type="dxa"/>
+              <w:left w:w="150" w:type="dxa"/>
+              <w:bottom w:w="120" w:type="dxa"/>
+              <w:right w:w="150" w:type="dxa"/>
+            </w:tcMar>
+            <w:vAlign w:val="center"/>
+          </w:tcPr>
+          <w:p>
+            <w:pPr>
+              <w:pStyle w:val="TableCell"/>
+            </w:pPr>
+            <w:r>
+              <w:t xml:space="preserve">The simplest reliable stack - Source folder: approved product page, brand guide, claim evidence, customer-language notes…</w:t>
+            </w:r>
+          </w:p>
+        </w:tc>
+      </w:tr>
+      <w:tr>
+        <w:tc>
+          <w:tcPr>
+            <w:tcW w:w="1500" w:type="dxa"/>
             <w:tcMar>
               <w:top w:w="120" w:type="dxa"/>
               <w:left w:w="150" w:type="dxa"/>
@@ -787,29 +793,29 @@
         </w:tc>
         <w:tc>
           <w:tcPr>
-            <w:tcW w:w="7940" w:type="dxa"/>
-            <w:tcMar>
-              <w:top w:w="120" w:type="dxa"/>
-              <w:left w:w="150" w:type="dxa"/>
-              <w:bottom w:w="120" w:type="dxa"/>
-              <w:right w:w="150" w:type="dxa"/>
-            </w:tcMar>
-            <w:vAlign w:val="center"/>
-          </w:tcPr>
-          <w:p>
-            <w:pPr>
-              <w:pStyle w:val="TableCell"/>
-            </w:pPr>
-            <w:r>
-              <w:t xml:space="preserve">Automation schedule - Daily lead triage: every weekday morning.</w:t>
-            </w:r>
-          </w:p>
-        </w:tc>
-      </w:tr>
-      <w:tr>
-        <w:tc>
-          <w:tcPr>
-            <w:tcW w:w="1180" w:type="dxa"/>
+            <w:tcW w:w="7620" w:type="dxa"/>
+            <w:tcMar>
+              <w:top w:w="120" w:type="dxa"/>
+              <w:left w:w="150" w:type="dxa"/>
+              <w:bottom w:w="120" w:type="dxa"/>
+              <w:right w:w="150" w:type="dxa"/>
+            </w:tcMar>
+            <w:vAlign w:val="center"/>
+          </w:tcPr>
+          <w:p>
+            <w:pPr>
+              <w:pStyle w:val="TableCell"/>
+            </w:pPr>
+            <w:r>
+              <w:t xml:space="preserve">Minimum viable weekly loop - 1. Select: choose one approved product, audience, channel, and creative goal.</w:t>
+            </w:r>
+          </w:p>
+        </w:tc>
+      </w:tr>
+      <w:tr>
+        <w:tc>
+          <w:tcPr>
+            <w:tcW w:w="1500" w:type="dxa"/>
             <w:shd w:fill="F5F3F1"/>
             <w:tcMar>
               <w:top w:w="120" w:type="dxa"/>
@@ -830,30 +836,30 @@
         </w:tc>
         <w:tc>
           <w:tcPr>
-            <w:tcW w:w="7940" w:type="dxa"/>
-            <w:shd w:fill="F5F3F1"/>
-            <w:tcMar>
-              <w:top w:w="120" w:type="dxa"/>
-              <w:left w:w="150" w:type="dxa"/>
-              <w:bottom w:w="120" w:type="dxa"/>
-              <w:right w:w="150" w:type="dxa"/>
-            </w:tcMar>
-            <w:vAlign w:val="center"/>
-          </w:tcPr>
-          <w:p>
-            <w:pPr>
-              <w:pStyle w:val="TableCell"/>
-            </w:pPr>
-            <w:r>
-              <w:t xml:space="preserve">Daily lead triage - runs every weekday morning - You are an intake assistant for a ugc brief generator serving ecommerce brands. Here are…</w:t>
-            </w:r>
-          </w:p>
-        </w:tc>
-      </w:tr>
-      <w:tr>
-        <w:tc>
-          <w:tcPr>
-            <w:tcW w:w="1180" w:type="dxa"/>
+            <w:tcW w:w="7620" w:type="dxa"/>
+            <w:shd w:fill="F5F3F1"/>
+            <w:tcMar>
+              <w:top w:w="120" w:type="dxa"/>
+              <w:left w:w="150" w:type="dxa"/>
+              <w:bottom w:w="120" w:type="dxa"/>
+              <w:right w:w="150" w:type="dxa"/>
+            </w:tcMar>
+            <w:vAlign w:val="center"/>
+          </w:tcPr>
+          <w:p>
+            <w:pPr>
+              <w:pStyle w:val="TableCell"/>
+            </w:pPr>
+            <w:r>
+              <w:t xml:space="preserve">Weekly product opportunity prompt - Review [APPROVED PRODUCT PAGES, REVIEWS OR EXPORTS, AND RECENT CREATIVE] for [BRAND]…</w:t>
+            </w:r>
+          </w:p>
+        </w:tc>
+      </w:tr>
+      <w:tr>
+        <w:tc>
+          <w:tcPr>
+            <w:tcW w:w="1500" w:type="dxa"/>
             <w:tcMar>
               <w:top w:w="120" w:type="dxa"/>
               <w:left w:w="150" w:type="dxa"/>
@@ -873,29 +879,29 @@
         </w:tc>
         <w:tc>
           <w:tcPr>
-            <w:tcW w:w="7940" w:type="dxa"/>
-            <w:tcMar>
-              <w:top w:w="120" w:type="dxa"/>
-              <w:left w:w="150" w:type="dxa"/>
-              <w:bottom w:w="120" w:type="dxa"/>
-              <w:right w:w="150" w:type="dxa"/>
-            </w:tcMar>
-            <w:vAlign w:val="center"/>
-          </w:tcPr>
-          <w:p>
-            <w:pPr>
-              <w:pStyle w:val="TableCell"/>
-            </w:pPr>
-            <w:r>
-              <w:t xml:space="preserve">Weekly prospect list - runs every Monday - You are a local lead researcher for a ugc brief generator. Target buyer: Ecommerce brands…</w:t>
-            </w:r>
-          </w:p>
-        </w:tc>
-      </w:tr>
-      <w:tr>
-        <w:tc>
-          <w:tcPr>
-            <w:tcW w:w="1180" w:type="dxa"/>
+            <w:tcW w:w="7620" w:type="dxa"/>
+            <w:tcMar>
+              <w:top w:w="120" w:type="dxa"/>
+              <w:left w:w="150" w:type="dxa"/>
+              <w:bottom w:w="120" w:type="dxa"/>
+              <w:right w:w="150" w:type="dxa"/>
+            </w:tcMar>
+            <w:vAlign w:val="center"/>
+          </w:tcPr>
+          <w:p>
+            <w:pPr>
+              <w:pStyle w:val="TableCell"/>
+            </w:pPr>
+            <w:r>
+              <w:t xml:space="preserve">Brief drafting prompt - Create a creator-ready brief for [PRODUCT] using only [APPROVED SOURCE PACK]. Include…</w:t>
+            </w:r>
+          </w:p>
+        </w:tc>
+      </w:tr>
+      <w:tr>
+        <w:tc>
+          <w:tcPr>
+            <w:tcW w:w="1500" w:type="dxa"/>
             <w:shd w:fill="F5F3F1"/>
             <w:tcMar>
               <w:top w:w="120" w:type="dxa"/>
@@ -916,30 +922,30 @@
         </w:tc>
         <w:tc>
           <w:tcPr>
-            <w:tcW w:w="7940" w:type="dxa"/>
-            <w:shd w:fill="F5F3F1"/>
-            <w:tcMar>
-              <w:top w:w="120" w:type="dxa"/>
-              <w:left w:w="150" w:type="dxa"/>
-              <w:bottom w:w="120" w:type="dxa"/>
-              <w:right w:w="150" w:type="dxa"/>
-            </w:tcMar>
-            <w:vAlign w:val="center"/>
-          </w:tcPr>
-          <w:p>
-            <w:pPr>
-              <w:pStyle w:val="TableCell"/>
-            </w:pPr>
-            <w:r>
-              <w:t xml:space="preserve">Outreach drafting prompt - runs twice a week - You write first-contact outreach for a ugc brief generator aimed at ecommerce brands. Here…</w:t>
-            </w:r>
-          </w:p>
-        </w:tc>
-      </w:tr>
-      <w:tr>
-        <w:tc>
-          <w:tcPr>
-            <w:tcW w:w="1180" w:type="dxa"/>
+            <w:tcW w:w="7620" w:type="dxa"/>
+            <w:shd w:fill="F5F3F1"/>
+            <w:tcMar>
+              <w:top w:w="120" w:type="dxa"/>
+              <w:left w:w="150" w:type="dxa"/>
+              <w:bottom w:w="120" w:type="dxa"/>
+              <w:right w:w="150" w:type="dxa"/>
+            </w:tcMar>
+            <w:vAlign w:val="center"/>
+          </w:tcPr>
+          <w:p>
+            <w:pPr>
+              <w:pStyle w:val="TableCell"/>
+            </w:pPr>
+            <w:r>
+              <w:t xml:space="preserve">Claims and source gate - Compare every proposed product statement in [DRAFT BRIEF] with [APPROVED SOURCE PACK]…</w:t>
+            </w:r>
+          </w:p>
+        </w:tc>
+      </w:tr>
+      <w:tr>
+        <w:tc>
+          <w:tcPr>
+            <w:tcW w:w="1500" w:type="dxa"/>
             <w:tcMar>
               <w:top w:w="120" w:type="dxa"/>
               <w:left w:w="150" w:type="dxa"/>
@@ -959,29 +965,29 @@
         </w:tc>
         <w:tc>
           <w:tcPr>
-            <w:tcW w:w="7940" w:type="dxa"/>
-            <w:tcMar>
-              <w:top w:w="120" w:type="dxa"/>
-              <w:left w:w="150" w:type="dxa"/>
-              <w:bottom w:w="120" w:type="dxa"/>
-              <w:right w:w="150" w:type="dxa"/>
-            </w:tcMar>
-            <w:vAlign w:val="center"/>
-          </w:tcPr>
-          <w:p>
-            <w:pPr>
-              <w:pStyle w:val="TableCell"/>
-            </w:pPr>
-            <w:r>
-              <w:t xml:space="preserve">Follow-up sequencer prompt - runs every weekday - You manage polite follow-ups. Here are prospects with no reply and the days since first…</w:t>
-            </w:r>
-          </w:p>
-        </w:tc>
-      </w:tr>
-      <w:tr>
-        <w:tc>
-          <w:tcPr>
-            <w:tcW w:w="1180" w:type="dxa"/>
+            <w:tcW w:w="7620" w:type="dxa"/>
+            <w:tcMar>
+              <w:top w:w="120" w:type="dxa"/>
+              <w:left w:w="150" w:type="dxa"/>
+              <w:bottom w:w="120" w:type="dxa"/>
+              <w:right w:w="150" w:type="dxa"/>
+            </w:tcMar>
+            <w:vAlign w:val="center"/>
+          </w:tcPr>
+          <w:p>
+            <w:pPr>
+              <w:pStyle w:val="TableCell"/>
+            </w:pPr>
+            <w:r>
+              <w:t xml:space="preserve">Rights and handoff gate - Check [DRAFT BRIEF] against [SIGNED USAGE TERMS]. Return PASS or HOLD for creator identity…</w:t>
+            </w:r>
+          </w:p>
+        </w:tc>
+      </w:tr>
+      <w:tr>
+        <w:tc>
+          <w:tcPr>
+            <w:tcW w:w="1500" w:type="dxa"/>
             <w:shd w:fill="F5F3F1"/>
             <w:tcMar>
               <w:top w:w="120" w:type="dxa"/>
@@ -1002,30 +1008,30 @@
         </w:tc>
         <w:tc>
           <w:tcPr>
-            <w:tcW w:w="7940" w:type="dxa"/>
-            <w:shd w:fill="F5F3F1"/>
-            <w:tcMar>
-              <w:top w:w="120" w:type="dxa"/>
-              <w:left w:w="150" w:type="dxa"/>
-              <w:bottom w:w="120" w:type="dxa"/>
-              <w:right w:w="150" w:type="dxa"/>
-            </w:tcMar>
-            <w:vAlign w:val="center"/>
-          </w:tcPr>
-          <w:p>
-            <w:pPr>
-              <w:pStyle w:val="TableCell"/>
-            </w:pPr>
-            <w:r>
-              <w:t xml:space="preserve">Delivery QA prompt - runs before every handoff - You are a delivery reviewer for a ugc brief generator. Here is the draft deliverable…</w:t>
-            </w:r>
-          </w:p>
-        </w:tc>
-      </w:tr>
-      <w:tr>
-        <w:tc>
-          <w:tcPr>
-            <w:tcW w:w="1180" w:type="dxa"/>
+            <w:tcW w:w="7620" w:type="dxa"/>
+            <w:shd w:fill="F5F3F1"/>
+            <w:tcMar>
+              <w:top w:w="120" w:type="dxa"/>
+              <w:left w:w="150" w:type="dxa"/>
+              <w:bottom w:w="120" w:type="dxa"/>
+              <w:right w:w="150" w:type="dxa"/>
+            </w:tcMar>
+            <w:vAlign w:val="center"/>
+          </w:tcPr>
+          <w:p>
+            <w:pPr>
+              <w:pStyle w:val="TableCell"/>
+            </w:pPr>
+            <w:r>
+              <w:t xml:space="preserve">Approval email draft - Draft one email to [BRAND APPROVER] linking the brief, claim-source list, rights checklist…</w:t>
+            </w:r>
+          </w:p>
+        </w:tc>
+      </w:tr>
+      <w:tr>
+        <w:tc>
+          <w:tcPr>
+            <w:tcW w:w="1500" w:type="dxa"/>
             <w:tcMar>
               <w:top w:w="120" w:type="dxa"/>
               <w:left w:w="150" w:type="dxa"/>
@@ -1045,29 +1051,29 @@
         </w:tc>
         <w:tc>
           <w:tcPr>
-            <w:tcW w:w="7940" w:type="dxa"/>
-            <w:tcMar>
-              <w:top w:w="120" w:type="dxa"/>
-              <w:left w:w="150" w:type="dxa"/>
-              <w:bottom w:w="120" w:type="dxa"/>
-              <w:right w:w="150" w:type="dxa"/>
-            </w:tcMar>
-            <w:vAlign w:val="center"/>
-          </w:tcPr>
-          <w:p>
-            <w:pPr>
-              <w:pStyle w:val="TableCell"/>
-            </w:pPr>
-            <w:r>
-              <w:t xml:space="preserve">Weekly report and client update - runs every Friday - You report on a ugc brief generator. Here is this week's activity: [prospects contacted…</w:t>
-            </w:r>
-          </w:p>
-        </w:tc>
-      </w:tr>
-      <w:tr>
-        <w:tc>
-          <w:tcPr>
-            <w:tcW w:w="1180" w:type="dxa"/>
+            <w:tcW w:w="7620" w:type="dxa"/>
+            <w:tcMar>
+              <w:top w:w="120" w:type="dxa"/>
+              <w:left w:w="150" w:type="dxa"/>
+              <w:bottom w:w="120" w:type="dxa"/>
+              <w:right w:w="150" w:type="dxa"/>
+            </w:tcMar>
+            <w:vAlign w:val="center"/>
+          </w:tcPr>
+          <w:p>
+            <w:pPr>
+              <w:pStyle w:val="TableCell"/>
+            </w:pPr>
+            <w:r>
+              <w:t xml:space="preserve">First 20 leads routine - Once a week, review 20 ecommerce brands in [PRODUCT CATEGORY] that already post…</w:t>
+            </w:r>
+          </w:p>
+        </w:tc>
+      </w:tr>
+      <w:tr>
+        <w:tc>
+          <w:tcPr>
+            <w:tcW w:w="1500" w:type="dxa"/>
             <w:shd w:fill="F5F3F1"/>
             <w:tcMar>
               <w:top w:w="120" w:type="dxa"/>
@@ -1088,30 +1094,30 @@
         </w:tc>
         <w:tc>
           <w:tcPr>
-            <w:tcW w:w="7940" w:type="dxa"/>
-            <w:shd w:fill="F5F3F1"/>
-            <w:tcMar>
-              <w:top w:w="120" w:type="dxa"/>
-              <w:left w:w="150" w:type="dxa"/>
-              <w:bottom w:w="120" w:type="dxa"/>
-              <w:right w:w="150" w:type="dxa"/>
-            </w:tcMar>
-            <w:vAlign w:val="center"/>
-          </w:tcPr>
-          <w:p>
-            <w:pPr>
-              <w:pStyle w:val="TableCell"/>
-            </w:pPr>
-            <w:r>
-              <w:t xml:space="preserve">Proof and referral repurposing - runs after each completed job - You repurpose finished work for a ugc brief generator. Here are the job details and…</w:t>
-            </w:r>
-          </w:p>
-        </w:tc>
-      </w:tr>
-      <w:tr>
-        <w:tc>
-          <w:tcPr>
-            <w:tcW w:w="1180" w:type="dxa"/>
+            <w:tcW w:w="7620" w:type="dxa"/>
+            <w:shd w:fill="F5F3F1"/>
+            <w:tcMar>
+              <w:top w:w="120" w:type="dxa"/>
+              <w:left w:w="150" w:type="dxa"/>
+              <w:bottom w:w="120" w:type="dxa"/>
+              <w:right w:w="150" w:type="dxa"/>
+            </w:tcMar>
+            <w:vAlign w:val="center"/>
+          </w:tcPr>
+          <w:p>
+            <w:pPr>
+              <w:pStyle w:val="TableCell"/>
+            </w:pPr>
+            <w:r>
+              <w:t xml:space="preserve">Failure and safety rules - Stop when source evidence is missing, rights are unclear, the request involves sensitive or…</w:t>
+            </w:r>
+          </w:p>
+        </w:tc>
+      </w:tr>
+      <w:tr>
+        <w:tc>
+          <w:tcPr>
+            <w:tcW w:w="1500" w:type="dxa"/>
             <w:tcMar>
               <w:top w:w="120" w:type="dxa"/>
               <w:left w:w="150" w:type="dxa"/>
@@ -1131,7 +1137,7 @@
         </w:tc>
         <w:tc>
           <w:tcPr>
-            <w:tcW w:w="7940" w:type="dxa"/>
+            <w:tcW w:w="7620" w:type="dxa"/>
             <w:tcMar>
               <w:top w:w="120" w:type="dxa"/>
               <w:left w:w="150" w:type="dxa"/>
@@ -1188,63 +1194,7 @@
         <w:pStyle w:val="Heading1"/>
       </w:pPr>
       <w:r>
-        <w:t xml:space="preserve">01 / How to use these automations</w:t>
-      </w:r>
-    </w:p>
-    <w:p>
-      <w:pPr>
-        <w:pStyle w:val="ListParagraph"/>
-        <w:numPr>
-          <w:ilvl w:val="0"/>
-          <w:numId w:val="1"/>
-        </w:numPr>
-      </w:pPr>
-      <w:r>
-        <w:t xml:space="preserve">Each automation below is a ready prompt you can paste into an AI agent (ChatGPT, Claude, or an agent platform) and run on a schedule.</w:t>
-      </w:r>
-    </w:p>
-    <w:p>
-      <w:pPr>
-        <w:pStyle w:val="ListParagraph"/>
-        <w:numPr>
-          <w:ilvl w:val="0"/>
-          <w:numId w:val="1"/>
-        </w:numPr>
-      </w:pPr>
-      <w:r>
-        <w:t xml:space="preserve">Give the agent only the inputs shown in [brackets], and keep a human approval step before anything is sent, published, or billed.</w:t>
-      </w:r>
-    </w:p>
-    <w:p>
-      <w:pPr>
-        <w:pStyle w:val="ListParagraph"/>
-        <w:numPr>
-          <w:ilvl w:val="0"/>
-          <w:numId w:val="1"/>
-        </w:numPr>
-      </w:pPr>
-      <w:r>
-        <w:t xml:space="preserve">Start with one automation, prove it for a week, then add the next so you learn to trust each output.</w:t>
-      </w:r>
-    </w:p>
-    <w:p>
-      <w:pPr>
-        <w:pStyle w:val="ListParagraph"/>
-        <w:numPr>
-          <w:ilvl w:val="0"/>
-          <w:numId w:val="1"/>
-        </w:numPr>
-      </w:pPr>
-      <w:r>
-        <w:t xml:space="preserve">Send each output to where you already work: inbox drafts, your CRM, or a shared job doc.</w:t>
-      </w:r>
-    </w:p>
-    <w:p>
-      <w:pPr>
-        <w:pStyle w:val="Heading1"/>
-      </w:pPr>
-      <w:r>
-        <w:t xml:space="preserve">02 / Automation schedule</w:t>
+        <w:t xml:space="preserve">01 / The simplest reliable stack</w:t>
       </w:r>
     </w:p>
     <w:tbl>
@@ -1266,6 +1216,9 @@
         <w:gridCol w:w="6180"/>
       </w:tblGrid>
       <w:tr>
+        <w:trPr>
+          <w:tblHeader/>
+        </w:trPr>
         <w:tc>
           <w:tcPr>
             <w:tcW w:w="3000" w:type="dxa"/>
@@ -1283,7 +1236,7 @@
               <w:pStyle w:val="TableHeader"/>
             </w:pPr>
             <w:r>
-              <w:t xml:space="preserve">Automation</w:t>
+              <w:t xml:space="preserve">Field</w:t>
             </w:r>
           </w:p>
         </w:tc>
@@ -1304,7 +1257,7 @@
               <w:pStyle w:val="TableHeader"/>
             </w:pPr>
             <w:r>
-              <w:t xml:space="preserve">When to run</w:t>
+              <w:t xml:space="preserve">Detail</w:t>
             </w:r>
           </w:p>
         </w:tc>
@@ -1327,7 +1280,7 @@
               <w:pStyle w:val="TableLabel"/>
             </w:pPr>
             <w:r>
-              <w:t xml:space="preserve">Daily lead triage</w:t>
+              <w:t xml:space="preserve">Source folder</w:t>
             </w:r>
           </w:p>
         </w:tc>
@@ -1348,7 +1301,7 @@
               <w:pStyle w:val="TableCell"/>
             </w:pPr>
             <w:r>
-              <w:t xml:space="preserve">every weekday morning.</w:t>
+              <w:t xml:space="preserve">approved product page, brand guide, claim evidence, customer-language notes, creator constraints, and signed usage-rights terms.</w:t>
             </w:r>
           </w:p>
         </w:tc>
@@ -1371,7 +1324,7 @@
               <w:pStyle w:val="TableLabel"/>
             </w:pPr>
             <w:r>
-              <w:t xml:space="preserve">Weekly prospect list</w:t>
+              <w:t xml:space="preserve">Control sheet</w:t>
             </w:r>
           </w:p>
         </w:tc>
@@ -1391,7 +1344,7 @@
               <w:pStyle w:val="TableCell"/>
             </w:pPr>
             <w:r>
-              <w:t xml:space="preserve">every Monday.</w:t>
+              <w:t xml:space="preserve">one row per product and concept with audience, channel, hook, proof source, claim status, creator, due date, rights scope, approver, and final file link.</w:t>
             </w:r>
           </w:p>
         </w:tc>
@@ -1414,7 +1367,7 @@
               <w:pStyle w:val="TableLabel"/>
             </w:pPr>
             <w:r>
-              <w:t xml:space="preserve">Outreach drafting</w:t>
+              <w:t xml:space="preserve">Production</w:t>
             </w:r>
           </w:p>
         </w:tc>
@@ -1435,7 +1388,7 @@
               <w:pStyle w:val="TableCell"/>
             </w:pPr>
             <w:r>
-              <w:t xml:space="preserve">twice a week.</w:t>
+              <w:t xml:space="preserve">one reusable creator brief template, one claims and rights checklist, and one approval email for each product.</w:t>
             </w:r>
           </w:p>
         </w:tc>
@@ -1458,7 +1411,7 @@
               <w:pStyle w:val="TableLabel"/>
             </w:pPr>
             <w:r>
-              <w:t xml:space="preserve">Follow-up sequencer</w:t>
+              <w:t xml:space="preserve">Automation</w:t>
             </w:r>
           </w:p>
         </w:tc>
@@ -1478,138 +1431,7 @@
               <w:pStyle w:val="TableCell"/>
             </w:pPr>
             <w:r>
-              <w:t xml:space="preserve">every weekday.</w:t>
-            </w:r>
-          </w:p>
-        </w:tc>
-      </w:tr>
-      <w:tr>
-        <w:tc>
-          <w:tcPr>
-            <w:tcW w:w="3000" w:type="dxa"/>
-            <w:shd w:fill="F5F3F1"/>
-            <w:tcMar>
-              <w:top w:w="120" w:type="dxa"/>
-              <w:left w:w="150" w:type="dxa"/>
-              <w:bottom w:w="120" w:type="dxa"/>
-              <w:right w:w="150" w:type="dxa"/>
-            </w:tcMar>
-            <w:vAlign w:val="center"/>
-          </w:tcPr>
-          <w:p>
-            <w:pPr>
-              <w:pStyle w:val="TableLabel"/>
-            </w:pPr>
-            <w:r>
-              <w:t xml:space="preserve">Delivery QA</w:t>
-            </w:r>
-          </w:p>
-        </w:tc>
-        <w:tc>
-          <w:tcPr>
-            <w:tcW w:w="6180" w:type="dxa"/>
-            <w:shd w:fill="F5F3F1"/>
-            <w:tcMar>
-              <w:top w:w="120" w:type="dxa"/>
-              <w:left w:w="150" w:type="dxa"/>
-              <w:bottom w:w="120" w:type="dxa"/>
-              <w:right w:w="150" w:type="dxa"/>
-            </w:tcMar>
-            <w:vAlign w:val="center"/>
-          </w:tcPr>
-          <w:p>
-            <w:pPr>
-              <w:pStyle w:val="TableCell"/>
-            </w:pPr>
-            <w:r>
-              <w:t xml:space="preserve">before every handoff.</w:t>
-            </w:r>
-          </w:p>
-        </w:tc>
-      </w:tr>
-      <w:tr>
-        <w:tc>
-          <w:tcPr>
-            <w:tcW w:w="3000" w:type="dxa"/>
-            <w:shd w:fill="F5F3F1"/>
-            <w:tcMar>
-              <w:top w:w="120" w:type="dxa"/>
-              <w:left w:w="150" w:type="dxa"/>
-              <w:bottom w:w="120" w:type="dxa"/>
-              <w:right w:w="150" w:type="dxa"/>
-            </w:tcMar>
-            <w:vAlign w:val="center"/>
-          </w:tcPr>
-          <w:p>
-            <w:pPr>
-              <w:pStyle w:val="TableLabel"/>
-            </w:pPr>
-            <w:r>
-              <w:t xml:space="preserve">Weekly report and client update</w:t>
-            </w:r>
-          </w:p>
-        </w:tc>
-        <w:tc>
-          <w:tcPr>
-            <w:tcW w:w="6180" w:type="dxa"/>
-            <w:tcMar>
-              <w:top w:w="120" w:type="dxa"/>
-              <w:left w:w="150" w:type="dxa"/>
-              <w:bottom w:w="120" w:type="dxa"/>
-              <w:right w:w="150" w:type="dxa"/>
-            </w:tcMar>
-            <w:vAlign w:val="center"/>
-          </w:tcPr>
-          <w:p>
-            <w:pPr>
-              <w:pStyle w:val="TableCell"/>
-            </w:pPr>
-            <w:r>
-              <w:t xml:space="preserve">every Friday.</w:t>
-            </w:r>
-          </w:p>
-        </w:tc>
-      </w:tr>
-      <w:tr>
-        <w:tc>
-          <w:tcPr>
-            <w:tcW w:w="3000" w:type="dxa"/>
-            <w:shd w:fill="F5F3F1"/>
-            <w:tcMar>
-              <w:top w:w="120" w:type="dxa"/>
-              <w:left w:w="150" w:type="dxa"/>
-              <w:bottom w:w="120" w:type="dxa"/>
-              <w:right w:w="150" w:type="dxa"/>
-            </w:tcMar>
-            <w:vAlign w:val="center"/>
-          </w:tcPr>
-          <w:p>
-            <w:pPr>
-              <w:pStyle w:val="TableLabel"/>
-            </w:pPr>
-            <w:r>
-              <w:t xml:space="preserve">Proof and referral repurposing</w:t>
-            </w:r>
-          </w:p>
-        </w:tc>
-        <w:tc>
-          <w:tcPr>
-            <w:tcW w:w="6180" w:type="dxa"/>
-            <w:shd w:fill="F5F3F1"/>
-            <w:tcMar>
-              <w:top w:w="120" w:type="dxa"/>
-              <w:left w:w="150" w:type="dxa"/>
-              <w:bottom w:w="120" w:type="dxa"/>
-              <w:right w:w="150" w:type="dxa"/>
-            </w:tcMar>
-            <w:vAlign w:val="center"/>
-          </w:tcPr>
-          <w:p>
-            <w:pPr>
-              <w:pStyle w:val="TableCell"/>
-            </w:pPr>
-            <w:r>
-              <w:t xml:space="preserve">after each completed job.</w:t>
+              <w:t xml:space="preserve">use AI to organise approved inputs, draft options, and run QA. Keep claims, rights, creator contact, publishing, and paid usage behind named human approval.</w:t>
             </w:r>
           </w:p>
         </w:tc>
@@ -1620,119 +1442,7 @@
         <w:pStyle w:val="Heading1"/>
       </w:pPr>
       <w:r>
-        <w:t xml:space="preserve">03 / Daily lead triage - runs every weekday morning</w:t>
-      </w:r>
-    </w:p>
-    <w:p>
-      <w:pPr>
-        <w:pStyle w:val="ExampleBlock"/>
-      </w:pPr>
-      <w:r>
-        <w:t xml:space="preserve">You are an intake assistant for a ugc brief generator serving ecommerce brands. Here are the new enquiries from the last 24 hours: [paste messages]. For each one, return a row with: sender, channel, intent (new job / question / complaint / spam), urgency (high/medium/low), the single missing detail to ask for, and a one-line suggested reply. Do not send anything. Put any urgent or safety-related message at the top for immediate human review.</w:t>
-      </w:r>
-    </w:p>
-    <w:p>
-      <w:pPr>
-        <w:pStyle w:val="Heading1"/>
-      </w:pPr>
-      <w:r>
-        <w:t xml:space="preserve">04 / Weekly prospect list - runs every Monday</w:t>
-      </w:r>
-    </w:p>
-    <w:p>
-      <w:pPr>
-        <w:pStyle w:val="ExampleBlock"/>
-      </w:pPr>
-      <w:r>
-        <w:t xml:space="preserve">You are a local lead researcher for a ugc brief generator. Target buyer: Ecommerce brands. Using [area / suburb / list source], produce 10 prospects who visibly have the problem this service solves. Return a table: name, location, the visible problem you would reference, the best first channel, and a one-line opener. Exclude anyone who looks high-risk, delicate, or out of scope.</w:t>
-      </w:r>
-    </w:p>
-    <w:p>
-      <w:pPr>
-        <w:pStyle w:val="Heading1"/>
-      </w:pPr>
-      <w:r>
-        <w:t xml:space="preserve">05 / Outreach drafting prompt - runs twice a week</w:t>
-      </w:r>
-    </w:p>
-    <w:p>
-      <w:pPr>
-        <w:pStyle w:val="ExampleBlock"/>
-      </w:pPr>
-      <w:r>
-        <w:t xml:space="preserve">You write first-contact outreach for a ugc brief generator aimed at ecommerce brands. Here is the prospect list: [paste rows]. For each prospect, draft a short, specific message that names the visible problem, offers the fixed-scope starter, and asks one easy yes/no question. Keep it under 90 words, with no hype and no guarantees. Return each draft labelled by prospect for human review before sending.</w:t>
-      </w:r>
-    </w:p>
-    <w:p>
-      <w:pPr>
-        <w:pStyle w:val="Heading1"/>
-      </w:pPr>
-      <w:r>
-        <w:t xml:space="preserve">06 / Follow-up sequencer prompt - runs every weekday</w:t>
-      </w:r>
-    </w:p>
-    <w:p>
-      <w:pPr>
-        <w:pStyle w:val="ExampleBlock"/>
-      </w:pPr>
-      <w:r>
-        <w:t xml:space="preserve">You manage polite follow-ups. Here are prospects with no reply and the days since first contact: [paste]. For each, draft the next message based on the gap: day 2 adds one new observation or sample, day 5 asks if it is handled internally, day 10 offers a smaller paid starter, day 21 closes the loop. Group drafts by prospect, never chase more than four times, and hold anything that should get a personal human note.</w:t>
-      </w:r>
-    </w:p>
-    <w:p>
-      <w:pPr>
-        <w:pStyle w:val="Heading1"/>
-      </w:pPr>
-      <w:r>
-        <w:t xml:space="preserve">07 / Delivery QA prompt - runs before every handoff</w:t>
-      </w:r>
-    </w:p>
-    <w:p>
-      <w:pPr>
-        <w:pStyle w:val="ExampleBlock"/>
-      </w:pPr>
-      <w:r>
-        <w:t xml:space="preserve">You are a delivery reviewer for a ugc brief generator. Here is the draft deliverable: [paste]. Check it against this standard: every fact, price, date, and claim is verifiable; nothing promises guaranteed results; the buyer can act within 30 seconds; every bracketed placeholder is replaced. Return a pass/fix list with the exact lines to change, then return it to the human owner instead of sending.</w:t>
-      </w:r>
-    </w:p>
-    <w:p>
-      <w:pPr>
-        <w:pStyle w:val="Heading1"/>
-      </w:pPr>
-      <w:r>
-        <w:t xml:space="preserve">08 / Weekly report and client update - runs every Friday</w:t>
-      </w:r>
-    </w:p>
-    <w:p>
-      <w:pPr>
-        <w:pStyle w:val="ExampleBlock"/>
-      </w:pPr>
-      <w:r>
-        <w:t xml:space="preserve">You report on a ugc brief generator. Here is this week's activity: [prospects contacted, replies, jobs booked, jobs delivered, revenue, issues]. Produce two outputs: (1) an internal summary with the top three numbers and the one bottleneck to fix next week; (2) a short, friendly update for each active client stating what was done, what is next, and any approval needed. Keep every claim factual and flag anything that needs owner approval.</w:t>
-      </w:r>
-    </w:p>
-    <w:p>
-      <w:pPr>
-        <w:pStyle w:val="Heading1"/>
-      </w:pPr>
-      <w:r>
-        <w:t xml:space="preserve">09 / Proof and referral repurposing - runs after each completed job</w:t>
-      </w:r>
-    </w:p>
-    <w:p>
-      <w:pPr>
-        <w:pStyle w:val="ExampleBlock"/>
-      </w:pPr>
-      <w:r>
-        <w:t xml:space="preserve">You repurpose finished work for a ugc brief generator. Here are the job details and before/after notes: [paste]. Draft: one social caption with the result and a soft call to action, one short message asking the client for a referral or review, and one line to add this example to the outreach sample library. Do not invent results or show identifying details without approval.</w:t>
-      </w:r>
-    </w:p>
-    <w:p>
-      <w:pPr>
-        <w:pStyle w:val="Heading1"/>
-      </w:pPr>
-      <w:r>
-        <w:t xml:space="preserve">10 / Delivery standards (shared)</w:t>
+        <w:t xml:space="preserve">02 / Minimum viable weekly loop</w:t>
       </w:r>
     </w:p>
     <w:p>
@@ -1744,7 +1454,7 @@
         </w:numPr>
       </w:pPr>
       <w:r>
-        <w:t xml:space="preserve">This asset is for ecommerce brands; replace bracketed fields with their specifics before sending.</w:t>
+        <w:t xml:space="preserve">1. Select: choose one approved product, audience, channel, and creative goal.</w:t>
       </w:r>
     </w:p>
     <w:p>
@@ -1756,7 +1466,7 @@
         </w:numPr>
       </w:pPr>
       <w:r>
-        <w:t xml:space="preserve">Full delivery standards - inputs to collect, evidence capture, pricing and scope guardrails, and the pre-send QA list - live once in this pack's AI Prompt Pack.</w:t>
+        <w:t xml:space="preserve">2. Research: collect product facts, customer language, objections, use cases, and current creator examples from approved sources.</w:t>
       </w:r>
     </w:p>
     <w:p>
@@ -1768,7 +1478,7 @@
         </w:numPr>
       </w:pPr>
       <w:r>
-        <w:t xml:space="preserve">Verify every fact, price, date, hour, link, and claim against a source, and keep approvals in writing.</w:t>
+        <w:t xml:space="preserve">3. Draft: produce hook options, shot sequence, proof notes, call to action, creator instructions, and disclosure fields.</w:t>
       </w:r>
     </w:p>
     <w:p>
@@ -1780,20 +1490,247 @@
         </w:numPr>
       </w:pPr>
       <w:r>
+        <w:t xml:space="preserve">4. Gate: hold every unsupported claim, unclear review quote, missing disclosure, or usage-rights conflict.</w:t>
+      </w:r>
+    </w:p>
+    <w:p>
+      <w:pPr>
+        <w:pStyle w:val="ListParagraph"/>
+        <w:numPr>
+          <w:ilvl w:val="0"/>
+          <w:numId w:val="1"/>
+        </w:numPr>
+      </w:pPr>
+      <w:r>
+        <w:t xml:space="preserve">5. Approve: send one brief and its claim-source list to the named brand approver.</w:t>
+      </w:r>
+    </w:p>
+    <w:p>
+      <w:pPr>
+        <w:pStyle w:val="ListParagraph"/>
+        <w:numPr>
+          <w:ilvl w:val="0"/>
+          <w:numId w:val="1"/>
+        </w:numPr>
+      </w:pPr>
+      <w:r>
+        <w:t xml:space="preserve">6. Handoff: deliver only the approved version to the creator with the agreed rights, deadline, formats, and revision route.</w:t>
+      </w:r>
+    </w:p>
+    <w:p>
+      <w:pPr>
+        <w:pStyle w:val="ListParagraph"/>
+        <w:numPr>
+          <w:ilvl w:val="0"/>
+          <w:numId w:val="1"/>
+        </w:numPr>
+      </w:pPr>
+      <w:r>
+        <w:t xml:space="preserve">7. Learn: record creator questions, rejected claims, missing shots, and reusable patterns for the next brief.</w:t>
+      </w:r>
+    </w:p>
+    <w:p>
+      <w:pPr>
+        <w:pStyle w:val="Heading1"/>
+      </w:pPr>
+      <w:r>
+        <w:t xml:space="preserve">03 / Weekly product opportunity prompt</w:t>
+      </w:r>
+    </w:p>
+    <w:p>
+      <w:pPr>
+        <w:pStyle w:val="ExampleBlock"/>
+      </w:pPr>
+      <w:r>
+        <w:t xml:space="preserve">Review [APPROVED PRODUCT PAGES, REVIEWS OR EXPORTS, AND RECENT CREATIVE] for [BRAND]. Return up to five product-specific UGC angles. For each, list the target buyer, customer-language problem, hook, required proof, three-shot sequence, call to action, source link, claim risk, and creator constraint. Use only facts and customer language in the supplied sources. Do not invent product experience, results, testimonials, comparisons, discounts, or usage rights. Mark any uncertain item HOLD.</w:t>
+      </w:r>
+    </w:p>
+    <w:p>
+      <w:pPr>
+        <w:pStyle w:val="Heading1"/>
+      </w:pPr>
+      <w:r>
+        <w:t xml:space="preserve">04 / Brief drafting prompt</w:t>
+      </w:r>
+    </w:p>
+    <w:p>
+      <w:pPr>
+        <w:pStyle w:val="ExampleBlock"/>
+      </w:pPr>
+      <w:r>
+        <w:t xml:space="preserve">Create a creator-ready brief for [PRODUCT] using only [APPROVED SOURCE PACK]. Include objective, target buyer, one core angle, five hook options, required shots, optional delivery ideas, approved proof points, prohibited claims, disclosure field, pronunciation notes, caption needs, call to action, aspect ratio, duration, raw-footage requirement, and approval checklist. Separate required beats from creative freedom. Do not contact a creator or publish anything.</w:t>
+      </w:r>
+    </w:p>
+    <w:p>
+      <w:pPr>
+        <w:pStyle w:val="Heading1"/>
+      </w:pPr>
+      <w:r>
+        <w:t xml:space="preserve">05 / Claims and source gate</w:t>
+      </w:r>
+    </w:p>
+    <w:p>
+      <w:pPr>
+        <w:pStyle w:val="ExampleBlock"/>
+      </w:pPr>
+      <w:r>
+        <w:t xml:space="preserve">Compare every proposed product statement in [DRAFT BRIEF] with [APPROVED SOURCE PACK]. Return a table with exact statement, source, status PASS or HOLD, reason, safer rewrite, and named approval needed. Hold unsupported outcomes, comparisons, superlatives, testimonials, regulated claims, before-and-after implications, and price or offer details that cannot be verified.</w:t>
+      </w:r>
+    </w:p>
+    <w:p>
+      <w:pPr>
+        <w:pStyle w:val="Heading1"/>
+      </w:pPr>
+      <w:r>
+        <w:t xml:space="preserve">06 / Rights and handoff gate</w:t>
+      </w:r>
+    </w:p>
+    <w:p>
+      <w:pPr>
+        <w:pStyle w:val="ExampleBlock"/>
+      </w:pPr>
+      <w:r>
+        <w:t xml:space="preserve">Check [DRAFT BRIEF] against [SIGNED USAGE TERMS]. Return PASS or HOLD for creator identity, organic channels, paid usage, whitelisting, territory, duration, raw footage, editing, resizing, translation, exclusivity, music, third-party assets, and renewal. Do not infer missing rights. Produce a clean handoff list only for approved items.</w:t>
+      </w:r>
+    </w:p>
+    <w:p>
+      <w:pPr>
+        <w:pStyle w:val="Heading1"/>
+      </w:pPr>
+      <w:r>
+        <w:t xml:space="preserve">07 / Approval email draft</w:t>
+      </w:r>
+    </w:p>
+    <w:p>
+      <w:pPr>
+        <w:pStyle w:val="ExampleBlock"/>
+      </w:pPr>
+      <w:r>
+        <w:t xml:space="preserve">Draft one email to [BRAND APPROVER] linking the brief, claim-source list, rights checklist, and creator handoff. Group decisions into APPROVE, EDIT, and HOLD. Ask the approver to confirm claims, required shots, disclosures, call to action, channels, rights, and deadline. Save as a draft. Do not send or share the brief with the creator.</w:t>
+      </w:r>
+    </w:p>
+    <w:p>
+      <w:pPr>
+        <w:pStyle w:val="Heading1"/>
+      </w:pPr>
+      <w:r>
+        <w:t xml:space="preserve">08 / First 20 leads routine</w:t>
+      </w:r>
+    </w:p>
+    <w:p>
+      <w:pPr>
+        <w:pStyle w:val="ExampleBlock"/>
+      </w:pPr>
+      <w:r>
+        <w:t xml:space="preserve">Once a week, review 20 ecommerce brands in [PRODUCT CATEGORY] that already post creator-style content. Return brands with one product that has clear reviews, repeated buyer objections, and visible brief gaps. Record the public product URL, creative evidence, one mini-brief angle, likely decision-maker role, and public contact channel. Do not collect private data or send outreach.</w:t>
+      </w:r>
+    </w:p>
+    <w:p>
+      <w:pPr>
+        <w:pStyle w:val="ExampleBlock"/>
+      </w:pPr>
+      <w:r>
+        <w:t xml:space="preserve">For the five strongest prospects, draft a message under 70 words offering a one-product mini-brief with one hook, three shots, and one claim boundary. Keep every message in drafts for human review.</w:t>
+      </w:r>
+    </w:p>
+    <w:p>
+      <w:pPr>
+        <w:pStyle w:val="Heading1"/>
+      </w:pPr>
+      <w:r>
+        <w:t xml:space="preserve">09 / Failure and safety rules</w:t>
+      </w:r>
+    </w:p>
+    <w:p>
+      <w:pPr>
+        <w:pStyle w:val="ListParagraph"/>
+        <w:numPr>
+          <w:ilvl w:val="0"/>
+          <w:numId w:val="1"/>
+        </w:numPr>
+      </w:pPr>
+      <w:r>
+        <w:t xml:space="preserve">Stop when source evidence is missing, rights are unclear, the request involves sensitive or regulated claims, a creator is asked to fake experience, or a named approver is absent.</w:t>
+      </w:r>
+    </w:p>
+    <w:p>
+      <w:pPr>
+        <w:pStyle w:val="ListParagraph"/>
+        <w:numPr>
+          <w:ilvl w:val="0"/>
+          <w:numId w:val="1"/>
+        </w:numPr>
+      </w:pPr>
+      <w:r>
+        <w:t xml:space="preserve">Do not automate creator contact, contract acceptance, rights expansion, public posting, paid boosting, whitelisting, legal review, payment, or final approval.</w:t>
+      </w:r>
+    </w:p>
+    <w:p>
+      <w:pPr>
+        <w:pStyle w:val="ListParagraph"/>
+        <w:numPr>
+          <w:ilvl w:val="0"/>
+          <w:numId w:val="1"/>
+        </w:numPr>
+      </w:pPr>
+      <w:r>
+        <w:t xml:space="preserve">Log the source pack, model, run date, draft version, held claims, rights status, human approver, creator handoff date, and final filename.</w:t>
+      </w:r>
+    </w:p>
+    <w:p>
+      <w:pPr>
+        <w:pStyle w:val="Heading1"/>
+      </w:pPr>
+      <w:r>
+        <w:t xml:space="preserve">10 / Delivery standards (shared)</w:t>
+      </w:r>
+    </w:p>
+    <w:p>
+      <w:pPr>
+        <w:pStyle w:val="ListParagraph"/>
+        <w:numPr>
+          <w:ilvl w:val="0"/>
+          <w:numId w:val="1"/>
+        </w:numPr>
+      </w:pPr>
+      <w:r>
+        <w:t xml:space="preserve">This asset is for ecommerce brands; replace bracketed fields with their specifics before sending.</w:t>
+      </w:r>
+    </w:p>
+    <w:p>
+      <w:pPr>
+        <w:pStyle w:val="ListParagraph"/>
+        <w:numPr>
+          <w:ilvl w:val="0"/>
+          <w:numId w:val="1"/>
+        </w:numPr>
+      </w:pPr>
+      <w:r>
+        <w:t xml:space="preserve">Full delivery standards - inputs to collect, evidence capture, pricing and scope guardrails, and the pre-send QA list - live once in this pack's AI Prompt Pack.</w:t>
+      </w:r>
+    </w:p>
+    <w:p>
+      <w:pPr>
+        <w:pStyle w:val="ListParagraph"/>
+        <w:numPr>
+          <w:ilvl w:val="0"/>
+          <w:numId w:val="1"/>
+        </w:numPr>
+      </w:pPr>
+      <w:r>
+        <w:t xml:space="preserve">Verify every fact, price, date, hour, link, and claim against a source, and keep approvals in writing.</w:t>
+      </w:r>
+    </w:p>
+    <w:p>
+      <w:pPr>
+        <w:pStyle w:val="ListParagraph"/>
+        <w:numPr>
+          <w:ilvl w:val="0"/>
+          <w:numId w:val="1"/>
+        </w:numPr>
+      </w:pPr>
+      <w:r>
         <w:t xml:space="preserve">Never imply guaranteed revenue, rankings, bookings, retention, or ad performance.</w:t>
-      </w:r>
-    </w:p>
-    <w:p>
-      <w:pPr>
-        <w:pStyle w:val="Heading1"/>
-      </w:pPr>
-      <w:r>
-        <w:t xml:space="preserve">Commercial use note</w:t>
-      </w:r>
-    </w:p>
-    <w:p>
-      <w:r>
-        <w:t xml:space="preserve">These templates are practical launch materials. They do not guarantee revenue, rankings, retention, or advertising performance. Validate claims with buyer data and keep approvals in writing.</w:t>
       </w:r>
     </w:p>
     <w:sectPr>

</xml_diff>